<commit_message>
User manual .pdf added to the standalone app folder.
</commit_message>
<xml_diff>
--- a/utilities/G-PEARL_manual.docx
+++ b/utilities/G-PEARL_manual.docx
@@ -588,7 +588,7 @@
           <w:bCs/>
           <w:sz w:val="22"/>
           <w:szCs w:val="22"/>
-          <w:lang w:val="en-CA"/>
+          <w:lang w:val="fr-FR"/>
         </w:rPr>
       </w:pPr>
       <w:r>
@@ -598,7 +598,7 @@
           <w:bCs/>
           <w:sz w:val="22"/>
           <w:szCs w:val="22"/>
-          <w:lang w:val="en-CA"/>
+          <w:lang w:val="fr-FR"/>
         </w:rPr>
         <w:t>1. Prerequisites</w:t>
       </w:r>
@@ -746,6 +746,81 @@
           <w:lang w:val="en-CA"/>
         </w:rPr>
         <w:t>can be followed for installation.</w:t>
+      </w:r>
+    </w:p>
+    <w:p>
+      <w:pPr>
+        <w:rPr>
+          <w:rFonts w:ascii="Helvetica" w:hAnsi="Helvetica" w:cs="Helvetica"/>
+          <w:sz w:val="22"/>
+          <w:szCs w:val="22"/>
+          <w:lang w:val="en-CA"/>
+        </w:rPr>
+      </w:pPr>
+      <w:r>
+        <w:rPr>
+          <w:rFonts w:ascii="Helvetica" w:hAnsi="Helvetica" w:cs="Helvetica"/>
+          <w:sz w:val="22"/>
+          <w:szCs w:val="22"/>
+          <w:lang w:val="en-CA"/>
+        </w:rPr>
+        <w:t xml:space="preserve">The support to automatic report generation requires </w:t>
+      </w:r>
+      <w:r>
+        <w:rPr>
+          <w:rFonts w:ascii="Helvetica" w:hAnsi="Helvetica" w:cs="Helvetica"/>
+          <w:b/>
+          <w:bCs/>
+          <w:sz w:val="22"/>
+          <w:szCs w:val="22"/>
+          <w:lang w:val="en-CA"/>
+        </w:rPr>
+        <w:t>Microsoft Word</w:t>
+      </w:r>
+      <w:r>
+        <w:rPr>
+          <w:rFonts w:ascii="Helvetica" w:hAnsi="Helvetica" w:cs="Helvetica"/>
+          <w:sz w:val="22"/>
+          <w:szCs w:val="22"/>
+          <w:lang w:val="en-CA"/>
+        </w:rPr>
+        <w:t xml:space="preserve"> correctly installed in your </w:t>
+      </w:r>
+      <w:r>
+        <w:rPr>
+          <w:rFonts w:ascii="Helvetica" w:hAnsi="Helvetica" w:cs="Helvetica"/>
+          <w:sz w:val="22"/>
+          <w:szCs w:val="22"/>
+          <w:lang w:val="en-CA"/>
+        </w:rPr>
+        <w:t>s</w:t>
+      </w:r>
+      <w:r>
+        <w:rPr>
+          <w:rFonts w:ascii="Helvetica" w:hAnsi="Helvetica" w:cs="Helvetica"/>
+          <w:sz w:val="22"/>
+          <w:szCs w:val="22"/>
+          <w:lang w:val="en-CA"/>
+        </w:rPr>
+        <w:t>ystem.</w:t>
+      </w:r>
+      <w:r>
+        <w:rPr>
+          <w:rFonts w:ascii="Helvetica" w:hAnsi="Helvetica" w:cs="Helvetica"/>
+          <w:sz w:val="22"/>
+          <w:szCs w:val="22"/>
+          <w:lang w:val="en-CA"/>
+        </w:rPr>
+        <w:t xml:space="preserve"> G-PEARL analysis functionalities are preserved even in case report generation </w:t>
+      </w:r>
+      <w:r>
+        <w:rPr>
+          <w:rFonts w:ascii="Helvetica" w:hAnsi="Helvetica" w:cs="Helvetica"/>
+          <w:sz w:val="22"/>
+          <w:szCs w:val="22"/>
+          <w:lang w:val="en-CA"/>
+        </w:rPr>
+        <w:t>fails.</w:t>
       </w:r>
     </w:p>
     <w:p>
@@ -900,27 +975,7 @@
             <w:szCs w:val="22"/>
             <w:lang w:val="en-CA"/>
           </w:rPr>
-          <w:t>https://www.mathworks.com/products/compiler/mcr/inde</w:t>
-        </w:r>
-        <w:r>
-          <w:rPr>
-            <w:rStyle w:val="Collegamentoipertestuale"/>
-            <w:rFonts w:ascii="Helvetica" w:hAnsi="Helvetica" w:cs="Helvetica"/>
-            <w:sz w:val="22"/>
-            <w:szCs w:val="22"/>
-            <w:lang w:val="en-CA"/>
-          </w:rPr>
-          <w:t>x</w:t>
-        </w:r>
-        <w:r>
-          <w:rPr>
-            <w:rStyle w:val="Collegamentoipertestuale"/>
-            <w:rFonts w:ascii="Helvetica" w:hAnsi="Helvetica" w:cs="Helvetica"/>
-            <w:sz w:val="22"/>
-            <w:szCs w:val="22"/>
-            <w:lang w:val="en-CA"/>
-          </w:rPr>
-          <w:t>.html</w:t>
+          <w:t>https://www.mathworks.com/products/compiler/mcr/index.html</w:t>
         </w:r>
       </w:hyperlink>
     </w:p>
@@ -1024,18 +1079,7 @@
           <w:szCs w:val="22"/>
           <w:lang w:val="en-CA"/>
         </w:rPr>
-        <w:t xml:space="preserve"> – </w:t>
-      </w:r>
-      <w:r>
-        <w:rPr>
-          <w:rFonts w:ascii="Helvetica" w:hAnsi="Helvetica" w:cs="Helvetica"/>
-          <w:b/>
-          <w:bCs/>
-          <w:sz w:val="22"/>
-          <w:szCs w:val="22"/>
-          <w:lang w:val="en-CA"/>
-        </w:rPr>
-        <w:t>Automatic installation from G-PEARL installation wizard</w:t>
+        <w:t xml:space="preserve"> – Automatic installation from G-PEARL installation wizard</w:t>
       </w:r>
     </w:p>
     <w:p>
@@ -1476,15 +1520,6 @@
           <v:rect id="_x0000_i1026" style="width:0;height:1.5pt" o:hralign="center" o:hrstd="t" o:hr="t" fillcolor="#a0a0a0" stroked="f"/>
         </w:pict>
       </w:r>
-    </w:p>
-    <w:p>
-      <w:pPr>
-        <w:rPr>
-          <w:rFonts w:ascii="Helvetica" w:hAnsi="Helvetica" w:cs="Helvetica"/>
-          <w:sz w:val="22"/>
-          <w:szCs w:val="22"/>
-        </w:rPr>
-      </w:pPr>
     </w:p>
     <w:p>
       <w:pPr>
@@ -3117,23 +3152,6 @@
     </w:p>
     <w:p>
       <w:pPr>
-        <w:rPr>
-          <w:rFonts w:ascii="Helvetica" w:hAnsi="Helvetica" w:cs="Helvetica"/>
-          <w:sz w:val="22"/>
-          <w:szCs w:val="22"/>
-        </w:rPr>
-      </w:pPr>
-      <w:r>
-        <w:rPr>
-          <w:rFonts w:ascii="Helvetica" w:hAnsi="Helvetica" w:cs="Helvetica"/>
-          <w:sz w:val="22"/>
-          <w:szCs w:val="22"/>
-        </w:rPr>
-        <w:br w:type="page"/>
-      </w:r>
-    </w:p>
-    <w:p>
-      <w:pPr>
         <w:shd w:val="clear" w:color="auto" w:fill="F2F2F2" w:themeFill="background1" w:themeFillShade="F2"/>
         <w:spacing w:before="160" w:after="0" w:line="259" w:lineRule="auto"/>
         <w:jc w:val="both"/>
@@ -3161,7 +3179,6 @@
           <w:lang w:val="en-CA" w:eastAsia="en-US" w:bidi="it-IT"/>
           <w14:ligatures w14:val="none"/>
         </w:rPr>
-        <w:lastRenderedPageBreak/>
         <w:t>1.c Measure raw code pseudoranges</w:t>
       </w:r>
     </w:p>
@@ -3463,6 +3480,7 @@
           <w:lang w:val="en-CA" w:eastAsia="en-US" w:bidi="it-IT"/>
           <w14:ligatures w14:val="none"/>
         </w:rPr>
+        <w:lastRenderedPageBreak/>
         <w:t>1.g Evaluate the effect of Ionosphere</w:t>
       </w:r>
     </w:p>
@@ -3739,7 +3757,6 @@
           <w:lang w:val="en-CA" w:eastAsia="en-US" w:bidi="it-IT"/>
           <w14:ligatures w14:val="none"/>
         </w:rPr>
-        <w:lastRenderedPageBreak/>
         <w:t>2.a Characterize Positioning solutions</w:t>
       </w:r>
     </w:p>
@@ -4045,6 +4062,7 @@
           <w:sz w:val="22"/>
           <w:szCs w:val="22"/>
         </w:rPr>
+        <w:lastRenderedPageBreak/>
         <w:t>Total Doppler range of the search space(10 kH</w:t>
       </w:r>
       <w:r>
@@ -6925,6 +6943,7 @@
   <w:style w:type="character" w:default="1" w:styleId="Carpredefinitoparagrafo">
     <w:name w:val="Default Paragraph Font"/>
     <w:uiPriority w:val="1"/>
+    <w:semiHidden/>
     <w:unhideWhenUsed/>
   </w:style>
   <w:style w:type="table" w:default="1" w:styleId="Tabellanormale">

</xml_diff>